<commit_message>
progress with metric validation
</commit_message>
<xml_diff>
--- a/docs/tesis/Plan_de_tesis_Tedoldi.docx
+++ b/docs/tesis/Plan_de_tesis_Tedoldi.docx
@@ -258,10 +258,31 @@
         <w:jc w:val="center"/>
       </w:pPr>
       <w:r>
-        <w:t xml:space="preserve">Clasificación Arancelaria con </w:t>
-      </w:r>
-      <w:r>
-        <w:t>Procesamiento de Lenguaje Natural</w:t>
+        <w:t xml:space="preserve">Clasificación </w:t>
+      </w:r>
+      <w:r>
+        <w:t>a</w:t>
+      </w:r>
+      <w:r>
+        <w:t xml:space="preserve">rancelaria con </w:t>
+      </w:r>
+      <w:r>
+        <w:t>p</w:t>
+      </w:r>
+      <w:r>
+        <w:t xml:space="preserve">rocesamiento de </w:t>
+      </w:r>
+      <w:r>
+        <w:t>l</w:t>
+      </w:r>
+      <w:r>
+        <w:t xml:space="preserve">enguaje </w:t>
+      </w:r>
+      <w:r>
+        <w:t>n</w:t>
+      </w:r>
+      <w:r>
+        <w:t>atural</w:t>
       </w:r>
     </w:p>
     <w:p>
@@ -807,8 +828,13 @@
             <w:pPr>
               <w:pStyle w:val="LO-normal"/>
             </w:pPr>
+            <w:proofErr w:type="spellStart"/>
             <w:r>
-              <w:t>Subheadings HS</w:t>
+              <w:t>Subheadings</w:t>
+            </w:r>
+            <w:proofErr w:type="spellEnd"/>
+            <w:r>
+              <w:t xml:space="preserve"> HS</w:t>
             </w:r>
           </w:p>
         </w:tc>
@@ -859,8 +885,13 @@
             <w:pPr>
               <w:pStyle w:val="LO-normal"/>
             </w:pPr>
+            <w:proofErr w:type="spellStart"/>
             <w:r>
-              <w:t>Headings HS</w:t>
+              <w:t>Headings</w:t>
+            </w:r>
+            <w:proofErr w:type="spellEnd"/>
+            <w:r>
+              <w:t xml:space="preserve"> HS</w:t>
             </w:r>
           </w:p>
         </w:tc>
@@ -921,8 +952,13 @@
             <w:pPr>
               <w:pStyle w:val="LO-normal"/>
             </w:pPr>
+            <w:proofErr w:type="spellStart"/>
             <w:r>
-              <w:t>Chapter HS</w:t>
+              <w:t>Chapter</w:t>
+            </w:r>
+            <w:proofErr w:type="spellEnd"/>
+            <w:r>
+              <w:t xml:space="preserve"> HS</w:t>
             </w:r>
           </w:p>
         </w:tc>
@@ -1249,6 +1285,7 @@
         </w:rPr>
         <w:t>, permite representar vectorialmente (</w:t>
       </w:r>
+      <w:proofErr w:type="spellStart"/>
       <w:r>
         <w:rPr>
           <w:i/>
@@ -1257,6 +1294,7 @@
         </w:rPr>
         <w:t>embbeding</w:t>
       </w:r>
+      <w:proofErr w:type="spellEnd"/>
       <w:r>
         <w:rPr>
           <w:lang w:val="es-AR"/>
@@ -1270,7 +1308,21 @@
         <w:rPr>
           <w:lang w:val="es-AR"/>
         </w:rPr>
-        <w:t xml:space="preserve"> para luego clasificarlas por medidas de similitud. Mientras tanto, FastText </w:t>
+        <w:t xml:space="preserve"> para luego clasificarlas por medidas de similitud. Mientras tanto, </w:t>
+      </w:r>
+      <w:proofErr w:type="spellStart"/>
+      <w:r>
+        <w:rPr>
+          <w:lang w:val="es-AR"/>
+        </w:rPr>
+        <w:t>FastText</w:t>
+      </w:r>
+      <w:proofErr w:type="spellEnd"/>
+      <w:r>
+        <w:rPr>
+          <w:lang w:val="es-AR"/>
+        </w:rPr>
+        <w:t xml:space="preserve"> </w:t>
       </w:r>
       <w:sdt>
         <w:sdtPr>
@@ -1311,7 +1363,23 @@
         </w:sdtContent>
       </w:sdt>
       <w:r>
-        <w:t xml:space="preserve"> presenta una oportunidad similar, con la ventaja de procesar subpalabras en lugar de palabras completas como hace Doc2Vec. Se puede decir que es una evolución de Word2Vec con avances en la tokenización empleada.</w:t>
+        <w:t xml:space="preserve"> presenta una oportunidad similar, con la ventaja de procesar </w:t>
+      </w:r>
+      <w:proofErr w:type="spellStart"/>
+      <w:r>
+        <w:t>subpalabras</w:t>
+      </w:r>
+      <w:proofErr w:type="spellEnd"/>
+      <w:r>
+        <w:t xml:space="preserve"> en lugar de palabras completas como hace Doc2Vec. Se puede decir que es una evolución de Word2Vec con avances en la </w:t>
+      </w:r>
+      <w:proofErr w:type="spellStart"/>
+      <w:r>
+        <w:t>tokenización</w:t>
+      </w:r>
+      <w:proofErr w:type="spellEnd"/>
+      <w:r>
+        <w:t xml:space="preserve"> empleada.</w:t>
       </w:r>
     </w:p>
     <w:p>
@@ -1362,6 +1430,7 @@
       <w:r>
         <w:t xml:space="preserve"> a las descripciones en cuestión. Estos, permiten además el aprovechamiento de modelos </w:t>
       </w:r>
+      <w:proofErr w:type="spellStart"/>
       <w:r>
         <w:rPr>
           <w:i/>
@@ -1369,8 +1438,25 @@
         </w:rPr>
         <w:t>opensource</w:t>
       </w:r>
-      <w:r>
-        <w:t xml:space="preserve"> preentrenados con corpus extensos, siendo muy utilizados en técnicas de Transfer Learning.</w:t>
+      <w:proofErr w:type="spellEnd"/>
+      <w:r>
+        <w:t xml:space="preserve"> </w:t>
+      </w:r>
+      <w:proofErr w:type="spellStart"/>
+      <w:r>
+        <w:t>preentrenados</w:t>
+      </w:r>
+      <w:proofErr w:type="spellEnd"/>
+      <w:r>
+        <w:t xml:space="preserve"> con corpus extensos, siendo muy utilizados en técnicas de Transfer </w:t>
+      </w:r>
+      <w:proofErr w:type="spellStart"/>
+      <w:r>
+        <w:t>Learning</w:t>
+      </w:r>
+      <w:proofErr w:type="spellEnd"/>
+      <w:r>
+        <w:t>.</w:t>
       </w:r>
     </w:p>
     <w:p>
@@ -1384,7 +1470,21 @@
         <w:rPr>
           <w:lang w:val="es-AR"/>
         </w:rPr>
-        <w:t xml:space="preserve">Finalmente, corresponde destacar que mediante fuentes como HuggingFace, la democratización de </w:t>
+        <w:t xml:space="preserve">Finalmente, corresponde destacar que mediante fuentes como </w:t>
+      </w:r>
+      <w:proofErr w:type="spellStart"/>
+      <w:r>
+        <w:rPr>
+          <w:lang w:val="es-AR"/>
+        </w:rPr>
+        <w:t>HuggingFace</w:t>
+      </w:r>
+      <w:proofErr w:type="spellEnd"/>
+      <w:r>
+        <w:rPr>
+          <w:lang w:val="es-AR"/>
+        </w:rPr>
+        <w:t xml:space="preserve">, la democratización de </w:t>
       </w:r>
       <w:r>
         <w:t>estos</w:t>
@@ -1393,7 +1493,21 @@
         <w:rPr>
           <w:lang w:val="es-AR"/>
         </w:rPr>
-        <w:t xml:space="preserve"> modelos (y muchos otros) es un hecho. DistilBERT </w:t>
+        <w:t xml:space="preserve"> modelos (y muchos otros) es un hecho. </w:t>
+      </w:r>
+      <w:proofErr w:type="spellStart"/>
+      <w:r>
+        <w:rPr>
+          <w:lang w:val="es-AR"/>
+        </w:rPr>
+        <w:t>DistilBERT</w:t>
+      </w:r>
+      <w:proofErr w:type="spellEnd"/>
+      <w:r>
+        <w:rPr>
+          <w:lang w:val="es-AR"/>
+        </w:rPr>
+        <w:t xml:space="preserve"> </w:t>
       </w:r>
       <w:sdt>
         <w:sdtPr>
@@ -1437,7 +1551,21 @@
         <w:rPr>
           <w:lang w:val="es-AR"/>
         </w:rPr>
-        <w:t>, un modelo preentrenado con un BERT como maestro, es una opción óptima para el desarrollo de herramientas donde la capacidad de cómputo es escaza y las aplicaciones pueden requerir una rápida inferencia.</w:t>
+        <w:t xml:space="preserve">, un modelo </w:t>
+      </w:r>
+      <w:proofErr w:type="spellStart"/>
+      <w:r>
+        <w:rPr>
+          <w:lang w:val="es-AR"/>
+        </w:rPr>
+        <w:t>preentrenado</w:t>
+      </w:r>
+      <w:proofErr w:type="spellEnd"/>
+      <w:r>
+        <w:rPr>
+          <w:lang w:val="es-AR"/>
+        </w:rPr>
+        <w:t xml:space="preserve"> con un BERT como maestro, es una opción óptima para el desarrollo de herramientas donde la capacidad de cómputo es escaza y las aplicaciones pueden requerir una rápida inferencia.</w:t>
       </w:r>
     </w:p>
     <w:p>
@@ -1466,7 +1594,15 @@
         <w:t xml:space="preserve">La </w:t>
       </w:r>
       <w:r>
-        <w:t>tesis busca asistir la clasificación arancelaria de mercaderías a nivel HS04 a partir de descripciones comerciales en texto libre. El caso de estudio utiliza un dataset de ~500 mil pares (descripción, código) en inglés, proveniente del proyecto BACUDA</w:t>
+        <w:t xml:space="preserve">tesis busca asistir la clasificación arancelaria de mercaderías a nivel HS04 a partir de descripciones comerciales en texto libre. El caso de estudio utiliza un </w:t>
+      </w:r>
+      <w:proofErr w:type="spellStart"/>
+      <w:r>
+        <w:t>dataset</w:t>
+      </w:r>
+      <w:proofErr w:type="spellEnd"/>
+      <w:r>
+        <w:t xml:space="preserve"> de ~500 mil pares (descripción, código) en inglés, proveniente del proyecto BACUDA</w:t>
       </w:r>
       <w:sdt>
         <w:sdtPr>
@@ -1492,7 +1628,15 @@
         </w:sdtContent>
       </w:sdt>
       <w:r>
-        <w:t xml:space="preserve">. El problema es multiclase, con miles de etiquetas y alto desbalanceo. La pregunta central es si, con estos datos, puede entrenarse un recomendador de códigos con precisión útil para la práctica aduanera. </w:t>
+        <w:t xml:space="preserve">. El problema es multiclase, con miles de etiquetas y alto desbalanceo. La pregunta central es si, con estos datos, puede entrenarse un </w:t>
+      </w:r>
+      <w:proofErr w:type="spellStart"/>
+      <w:r>
+        <w:t>recomendador</w:t>
+      </w:r>
+      <w:proofErr w:type="spellEnd"/>
+      <w:r>
+        <w:t xml:space="preserve"> de códigos con precisión útil para la práctica aduanera. </w:t>
       </w:r>
     </w:p>
     <w:p>
@@ -1599,6 +1743,7 @@
         </w:rPr>
         <w:t>: normalización, </w:t>
       </w:r>
+      <w:proofErr w:type="spellStart"/>
       <w:r>
         <w:rPr>
           <w:i/>
@@ -1607,6 +1752,7 @@
         </w:rPr>
         <w:t>stopwords</w:t>
       </w:r>
+      <w:proofErr w:type="spellEnd"/>
       <w:r>
         <w:rPr>
           <w:lang w:val="es-AR"/>
@@ -1637,33 +1783,29 @@
           <w:lang w:val="es-AR"/>
         </w:rPr>
       </w:pPr>
+      <w:proofErr w:type="spellStart"/>
       <w:r>
         <w:rPr>
           <w:b/>
           <w:bCs/>
           <w:lang w:val="es-AR"/>
         </w:rPr>
-        <w:t>Baselines:</w:t>
-      </w:r>
-      <w:r>
-        <w:rPr>
-          <w:lang w:val="es-AR"/>
-        </w:rPr>
-        <w:t> entrenar y evaluar </w:t>
-      </w:r>
+        <w:t>Baselines</w:t>
+      </w:r>
+      <w:proofErr w:type="spellEnd"/>
       <w:r>
         <w:rPr>
           <w:b/>
           <w:bCs/>
           <w:lang w:val="es-AR"/>
         </w:rPr>
-        <w:t>Doc2Vec</w:t>
-      </w:r>
-      <w:r>
-        <w:rPr>
-          <w:lang w:val="es-AR"/>
-        </w:rPr>
-        <w:t> y </w:t>
+        <w:t>:</w:t>
+      </w:r>
+      <w:r>
+        <w:rPr>
+          <w:lang w:val="es-AR"/>
+        </w:rPr>
+        <w:t> entrenar y evaluar </w:t>
       </w:r>
       <w:r>
         <w:rPr>
@@ -1671,8 +1813,24 @@
           <w:bCs/>
           <w:lang w:val="es-AR"/>
         </w:rPr>
+        <w:t>Doc2Vec</w:t>
+      </w:r>
+      <w:r>
+        <w:rPr>
+          <w:lang w:val="es-AR"/>
+        </w:rPr>
+        <w:t> y </w:t>
+      </w:r>
+      <w:proofErr w:type="spellStart"/>
+      <w:r>
+        <w:rPr>
+          <w:b/>
+          <w:bCs/>
+          <w:lang w:val="es-AR"/>
+        </w:rPr>
         <w:t>FastText</w:t>
       </w:r>
+      <w:proofErr w:type="spellEnd"/>
       <w:r>
         <w:rPr>
           <w:lang w:val="es-AR"/>
@@ -1781,6 +1939,7 @@
         </w:rPr>
         <w:t xml:space="preserve"> con </w:t>
       </w:r>
+      <w:proofErr w:type="spellStart"/>
       <w:r>
         <w:rPr>
           <w:b/>
@@ -1789,12 +1948,14 @@
         </w:rPr>
         <w:t>DistilBERT</w:t>
       </w:r>
+      <w:proofErr w:type="spellEnd"/>
       <w:r>
         <w:rPr>
           <w:lang w:val="es-AR"/>
         </w:rPr>
         <w:t xml:space="preserve"> como </w:t>
       </w:r>
+      <w:proofErr w:type="spellStart"/>
       <w:r>
         <w:rPr>
           <w:i/>
@@ -1803,12 +1964,28 @@
         </w:rPr>
         <w:t>encoder</w:t>
       </w:r>
-      <w:r>
-        <w:rPr>
-          <w:lang w:val="es-AR"/>
-        </w:rPr>
-        <w:t xml:space="preserve"> y una red neuronal como clasificador. Se evaluaron 3 técnicas de Transfer Learning: uso del </w:t>
-      </w:r>
+      <w:proofErr w:type="spellEnd"/>
+      <w:r>
+        <w:rPr>
+          <w:lang w:val="es-AR"/>
+        </w:rPr>
+        <w:t xml:space="preserve"> y una red neuronal como clasificador. Se evaluaron 3 técnicas de Transfer </w:t>
+      </w:r>
+      <w:proofErr w:type="spellStart"/>
+      <w:r>
+        <w:rPr>
+          <w:lang w:val="es-AR"/>
+        </w:rPr>
+        <w:t>Learning</w:t>
+      </w:r>
+      <w:proofErr w:type="spellEnd"/>
+      <w:r>
+        <w:rPr>
+          <w:lang w:val="es-AR"/>
+        </w:rPr>
+        <w:t xml:space="preserve">: uso del </w:t>
+      </w:r>
+      <w:proofErr w:type="spellStart"/>
       <w:r>
         <w:rPr>
           <w:i/>
@@ -1817,12 +1994,28 @@
         </w:rPr>
         <w:t>encoder</w:t>
       </w:r>
-      <w:r>
-        <w:rPr>
-          <w:lang w:val="es-AR"/>
-        </w:rPr>
-        <w:t xml:space="preserve"> preentrenado, ajustando 2 capas del </w:t>
-      </w:r>
+      <w:proofErr w:type="spellEnd"/>
+      <w:r>
+        <w:rPr>
+          <w:lang w:val="es-AR"/>
+        </w:rPr>
+        <w:t xml:space="preserve"> </w:t>
+      </w:r>
+      <w:proofErr w:type="spellStart"/>
+      <w:r>
+        <w:rPr>
+          <w:lang w:val="es-AR"/>
+        </w:rPr>
+        <w:t>preentrenado</w:t>
+      </w:r>
+      <w:proofErr w:type="spellEnd"/>
+      <w:r>
+        <w:rPr>
+          <w:lang w:val="es-AR"/>
+        </w:rPr>
+        <w:t xml:space="preserve">, ajustando 2 capas del </w:t>
+      </w:r>
+      <w:proofErr w:type="spellStart"/>
       <w:r>
         <w:rPr>
           <w:i/>
@@ -1831,6 +2024,7 @@
         </w:rPr>
         <w:t>encoder</w:t>
       </w:r>
+      <w:proofErr w:type="spellEnd"/>
       <w:r>
         <w:rPr>
           <w:lang w:val="es-AR"/>
@@ -1843,27 +2037,23 @@
           <w:iCs/>
           <w:lang w:val="es-AR"/>
         </w:rPr>
-        <w:t>fine-tuning</w:t>
-      </w:r>
-      <w:r>
-        <w:rPr>
-          <w:lang w:val="es-AR"/>
-        </w:rPr>
-        <w:t xml:space="preserve"> total del mismo. La clasificación se hizo a nivel de partida armonizada (códigos HS04), obteniendo resultados alentadores, superadores para el </w:t>
-      </w:r>
+        <w:t>fine-</w:t>
+      </w:r>
+      <w:proofErr w:type="spellStart"/>
       <w:r>
         <w:rPr>
           <w:i/>
           <w:iCs/>
           <w:lang w:val="es-AR"/>
         </w:rPr>
-        <w:t>fine-tuning</w:t>
-      </w:r>
-      <w:r>
-        <w:rPr>
-          <w:lang w:val="es-AR"/>
-        </w:rPr>
-        <w:t xml:space="preserve"> total del conjunto </w:t>
+        <w:t>tuning</w:t>
+      </w:r>
+      <w:proofErr w:type="spellEnd"/>
+      <w:r>
+        <w:rPr>
+          <w:lang w:val="es-AR"/>
+        </w:rPr>
+        <w:t xml:space="preserve"> total del mismo. La clasificación se hizo a nivel de partida armonizada (códigos HS04), obteniendo resultados alentadores, superadores para el </w:t>
       </w:r>
       <w:r>
         <w:rPr>
@@ -1871,8 +2061,34 @@
           <w:iCs/>
           <w:lang w:val="es-AR"/>
         </w:rPr>
+        <w:t>fine-</w:t>
+      </w:r>
+      <w:proofErr w:type="spellStart"/>
+      <w:r>
+        <w:rPr>
+          <w:i/>
+          <w:iCs/>
+          <w:lang w:val="es-AR"/>
+        </w:rPr>
+        <w:t>tuning</w:t>
+      </w:r>
+      <w:proofErr w:type="spellEnd"/>
+      <w:r>
+        <w:rPr>
+          <w:lang w:val="es-AR"/>
+        </w:rPr>
+        <w:t xml:space="preserve"> total del conjunto </w:t>
+      </w:r>
+      <w:proofErr w:type="spellStart"/>
+      <w:r>
+        <w:rPr>
+          <w:i/>
+          <w:iCs/>
+          <w:lang w:val="es-AR"/>
+        </w:rPr>
         <w:t>encoder-classifier</w:t>
       </w:r>
+      <w:proofErr w:type="spellEnd"/>
       <w:r>
         <w:rPr>
           <w:lang w:val="es-AR"/>
@@ -1900,7 +2116,21 @@
         <w:rPr>
           <w:lang w:val="es-AR"/>
         </w:rPr>
-        <w:t xml:space="preserve"> cada código HS04 en orden descendiente. Comparando los códigos más probables con el código correcto, se puede evaluar la tasa de acierto en los TopN. El modelo ganador del trabajo de Taller de Tesis 1 obtuvo en </w:t>
+        <w:t xml:space="preserve"> cada código HS04 en orden descendiente. Comparando los códigos más probables con el código correcto, se puede evaluar la tasa de acierto en los </w:t>
+      </w:r>
+      <w:proofErr w:type="spellStart"/>
+      <w:r>
+        <w:rPr>
+          <w:lang w:val="es-AR"/>
+        </w:rPr>
+        <w:t>TopN</w:t>
+      </w:r>
+      <w:proofErr w:type="spellEnd"/>
+      <w:r>
+        <w:rPr>
+          <w:lang w:val="es-AR"/>
+        </w:rPr>
+        <w:t xml:space="preserve">. El modelo ganador del trabajo de Taller de Tesis 1 obtuvo en </w:t>
       </w:r>
       <w:r>
         <w:rPr>
@@ -2011,7 +2241,21 @@
         <w:rPr>
           <w:lang w:val="es-AR"/>
         </w:rPr>
-        <w:t xml:space="preserve"> (e.g., </w:t>
+        <w:t xml:space="preserve"> (</w:t>
+      </w:r>
+      <w:proofErr w:type="spellStart"/>
+      <w:r>
+        <w:rPr>
+          <w:lang w:val="es-AR"/>
+        </w:rPr>
+        <w:t>e.g</w:t>
+      </w:r>
+      <w:proofErr w:type="spellEnd"/>
+      <w:r>
+        <w:rPr>
+          <w:lang w:val="es-AR"/>
+        </w:rPr>
+        <w:t xml:space="preserve">., </w:t>
       </w:r>
       <w:r>
         <w:rPr>
@@ -2027,6 +2271,7 @@
         </w:rPr>
         <w:t xml:space="preserve"> y </w:t>
       </w:r>
+      <w:proofErr w:type="spellStart"/>
       <w:r>
         <w:rPr>
           <w:b/>
@@ -2035,6 +2280,7 @@
         </w:rPr>
         <w:t>FastText</w:t>
       </w:r>
+      <w:proofErr w:type="spellEnd"/>
       <w:r>
         <w:rPr>
           <w:lang w:val="es-AR"/>
@@ -2070,6 +2316,7 @@
         </w:rPr>
         <w:t xml:space="preserve">Modelos tipo </w:t>
       </w:r>
+      <w:proofErr w:type="spellStart"/>
       <w:r>
         <w:rPr>
           <w:b/>
@@ -2078,12 +2325,14 @@
         </w:rPr>
         <w:t>transformer</w:t>
       </w:r>
+      <w:proofErr w:type="spellEnd"/>
       <w:r>
         <w:rPr>
           <w:lang w:val="es-AR"/>
         </w:rPr>
         <w:t xml:space="preserve"> (p.ej., </w:t>
       </w:r>
+      <w:proofErr w:type="spellStart"/>
       <w:r>
         <w:rPr>
           <w:b/>
@@ -2092,6 +2341,7 @@
         </w:rPr>
         <w:t>DistilBERT</w:t>
       </w:r>
+      <w:proofErr w:type="spellEnd"/>
       <w:r>
         <w:rPr>
           <w:lang w:val="es-AR"/>
@@ -2121,13 +2371,23 @@
         </w:rPr>
         <w:t xml:space="preserve">El plan contempla </w:t>
       </w:r>
+      <w:proofErr w:type="spellStart"/>
       <w:r>
         <w:rPr>
           <w:b/>
           <w:bCs/>
           <w:lang w:val="es-AR"/>
         </w:rPr>
-        <w:t>preprocesos simples</w:t>
+        <w:t>preprocesos</w:t>
+      </w:r>
+      <w:proofErr w:type="spellEnd"/>
+      <w:r>
+        <w:rPr>
+          <w:b/>
+          <w:bCs/>
+          <w:lang w:val="es-AR"/>
+        </w:rPr>
+        <w:t xml:space="preserve"> simples</w:t>
       </w:r>
       <w:r>
         <w:rPr>
@@ -2135,6 +2395,7 @@
         </w:rPr>
         <w:t xml:space="preserve"> (limpieza, normalización, variantes con/ sin </w:t>
       </w:r>
+      <w:proofErr w:type="spellStart"/>
       <w:r>
         <w:rPr>
           <w:i/>
@@ -2143,6 +2404,7 @@
         </w:rPr>
         <w:t>stopwords</w:t>
       </w:r>
+      <w:proofErr w:type="spellEnd"/>
       <w:r>
         <w:rPr>
           <w:lang w:val="es-AR"/>
@@ -2300,8 +2562,13 @@
         <w:pStyle w:val="LO-normal"/>
       </w:pPr>
       <w:r>
-        <w:t>Fase 1 — noviembre 2025: Ablaciones de preprocesamiento + baselines</w:t>
-      </w:r>
+        <w:t xml:space="preserve">Fase 1 — noviembre 2025: Ablaciones de preprocesamiento + </w:t>
+      </w:r>
+      <w:proofErr w:type="spellStart"/>
+      <w:r>
+        <w:t>baselines</w:t>
+      </w:r>
+      <w:proofErr w:type="spellEnd"/>
     </w:p>
     <w:p>
       <w:pPr>
@@ -2324,7 +2591,15 @@
         </w:numPr>
       </w:pPr>
       <w:r>
-        <w:t>Entrenamiento y evaluación de Doc2Vec y FastText como líneas de base.</w:t>
+        <w:t xml:space="preserve">Entrenamiento y evaluación de Doc2Vec y </w:t>
+      </w:r>
+      <w:proofErr w:type="spellStart"/>
+      <w:r>
+        <w:t>FastText</w:t>
+      </w:r>
+      <w:proofErr w:type="spellEnd"/>
+      <w:r>
+        <w:t xml:space="preserve"> como líneas de base.</w:t>
       </w:r>
     </w:p>
     <w:p>
@@ -2337,13 +2612,7 @@
         <w:pStyle w:val="LO-normal"/>
       </w:pPr>
       <w:r>
-        <w:t xml:space="preserve">Fase 2 — </w:t>
-      </w:r>
-      <w:r>
-        <w:t>febrero</w:t>
-      </w:r>
-      <w:r>
-        <w:t xml:space="preserve"> 2026: Transformers + comparativa integral + error</w:t>
+        <w:t>Fase 2 — febrero 2026: Transformers + comparativa integral + error</w:t>
       </w:r>
     </w:p>
     <w:p>
@@ -2355,7 +2624,15 @@
         </w:numPr>
       </w:pPr>
       <w:r>
-        <w:t>Entrenamiento y evaluación del modelo Transformer.</w:t>
+        <w:t xml:space="preserve">Entrenamiento y evaluación del modelo </w:t>
+      </w:r>
+      <w:proofErr w:type="spellStart"/>
+      <w:r>
+        <w:t>Transformer</w:t>
+      </w:r>
+      <w:proofErr w:type="spellEnd"/>
+      <w:r>
+        <w:t>.</w:t>
       </w:r>
     </w:p>
     <w:p>
@@ -2367,7 +2644,23 @@
         </w:numPr>
       </w:pPr>
       <w:r>
-        <w:t>Cuadro comparativo integral (baselines vs transformer), con métricas Top-N; análisis de confusiones por secciones y curvas de confianza.</w:t>
+        <w:t>Cuadro comparativo integral (</w:t>
+      </w:r>
+      <w:proofErr w:type="spellStart"/>
+      <w:r>
+        <w:t>baselines</w:t>
+      </w:r>
+      <w:proofErr w:type="spellEnd"/>
+      <w:r>
+        <w:t xml:space="preserve"> vs </w:t>
+      </w:r>
+      <w:proofErr w:type="spellStart"/>
+      <w:r>
+        <w:t>transformer</w:t>
+      </w:r>
+      <w:proofErr w:type="spellEnd"/>
+      <w:r>
+        <w:t>), con métricas Top-N; análisis de confusiones por secciones y curvas de confianza.</w:t>
       </w:r>
     </w:p>
     <w:p>
@@ -2380,13 +2673,7 @@
         <w:pStyle w:val="LO-normal"/>
       </w:pPr>
       <w:r>
-        <w:t xml:space="preserve">Fase 3 — </w:t>
-      </w:r>
-      <w:r>
-        <w:t>marzo</w:t>
-      </w:r>
-      <w:r>
-        <w:t xml:space="preserve"> 2026: Redacción y documentación</w:t>
+        <w:t>Fase 3 — marzo 2026: Redacción y documentación</w:t>
       </w:r>
     </w:p>
     <w:p>
@@ -2411,13 +2698,7 @@
         <w:pStyle w:val="LO-normal"/>
       </w:pPr>
       <w:r>
-        <w:t xml:space="preserve">Fase 4 — </w:t>
-      </w:r>
-      <w:r>
-        <w:t>abril</w:t>
-      </w:r>
-      <w:r>
-        <w:t xml:space="preserve"> 2026: Presentación y defensa</w:t>
+        <w:t>Fase 4 — abril 2026: Presentación y defensa</w:t>
       </w:r>
     </w:p>
     <w:p>
@@ -2518,6 +2799,7 @@
         </w:rPr>
         <w:t xml:space="preserve"> macro/</w:t>
       </w:r>
+      <w:proofErr w:type="spellStart"/>
       <w:r>
         <w:rPr>
           <w:i/>
@@ -2526,6 +2808,7 @@
         </w:rPr>
         <w:t>weighted</w:t>
       </w:r>
+      <w:proofErr w:type="spellEnd"/>
       <w:r>
         <w:rPr>
           <w:lang w:val="es-AR"/>
@@ -2689,6 +2972,7 @@
         </w:rPr>
         <w:t xml:space="preserve"> protocolos de evaluación consistentes, semillas fijadas y validaciones por </w:t>
       </w:r>
+      <w:proofErr w:type="spellStart"/>
       <w:r>
         <w:rPr>
           <w:i/>
@@ -2697,6 +2981,7 @@
         </w:rPr>
         <w:t>split</w:t>
       </w:r>
+      <w:proofErr w:type="spellEnd"/>
       <w:r>
         <w:rPr>
           <w:lang w:val="es-AR"/>
@@ -2710,7 +2995,21 @@
         <w:rPr>
           <w:lang w:val="es-AR"/>
         </w:rPr>
-        <w:t xml:space="preserve"> innecesaria en preprocesos.</w:t>
+        <w:t xml:space="preserve"> innecesaria en </w:t>
+      </w:r>
+      <w:proofErr w:type="spellStart"/>
+      <w:r>
+        <w:rPr>
+          <w:lang w:val="es-AR"/>
+        </w:rPr>
+        <w:t>preprocesos</w:t>
+      </w:r>
+      <w:proofErr w:type="spellEnd"/>
+      <w:r>
+        <w:rPr>
+          <w:lang w:val="es-AR"/>
+        </w:rPr>
+        <w:t>.</w:t>
       </w:r>
     </w:p>
     <w:p>
@@ -2779,8 +3078,18 @@
           <w:bCs/>
           <w:lang w:val="es-AR"/>
         </w:rPr>
-        <w:t>data needs</w:t>
-      </w:r>
+        <w:t xml:space="preserve">data </w:t>
+      </w:r>
+      <w:proofErr w:type="spellStart"/>
+      <w:r>
+        <w:rPr>
+          <w:b/>
+          <w:bCs/>
+          <w:lang w:val="es-AR"/>
+        </w:rPr>
+        <w:t>needs</w:t>
+      </w:r>
+      <w:proofErr w:type="spellEnd"/>
       <w:r>
         <w:rPr>
           <w:lang w:val="es-AR"/>
@@ -2821,35 +3130,45 @@
           <w:lang w:val="es-AR"/>
         </w:rPr>
       </w:pPr>
+      <w:proofErr w:type="spellStart"/>
       <w:r>
         <w:rPr>
           <w:b/>
           <w:bCs/>
           <w:lang w:val="es-AR"/>
         </w:rPr>
-        <w:t>Baseline comparado y justificado</w:t>
-      </w:r>
-      <w:r>
-        <w:rPr>
-          <w:lang w:val="es-AR"/>
-        </w:rPr>
-        <w:t xml:space="preserve">: </w:t>
-      </w:r>
-      <w:r>
-        <w:t>cuantificación</w:t>
-      </w:r>
-      <w:r>
-        <w:rPr>
-          <w:lang w:val="es-AR"/>
-        </w:rPr>
-        <w:t xml:space="preserve"> clara del </w:t>
-      </w:r>
+        <w:t>Baseline</w:t>
+      </w:r>
+      <w:proofErr w:type="spellEnd"/>
       <w:r>
         <w:rPr>
           <w:b/>
           <w:bCs/>
           <w:lang w:val="es-AR"/>
         </w:rPr>
+        <w:t xml:space="preserve"> comparado y justificado</w:t>
+      </w:r>
+      <w:r>
+        <w:rPr>
+          <w:lang w:val="es-AR"/>
+        </w:rPr>
+        <w:t xml:space="preserve">: </w:t>
+      </w:r>
+      <w:r>
+        <w:t>cuantificación</w:t>
+      </w:r>
+      <w:r>
+        <w:rPr>
+          <w:lang w:val="es-AR"/>
+        </w:rPr>
+        <w:t xml:space="preserve"> clara del </w:t>
+      </w:r>
+      <w:r>
+        <w:rPr>
+          <w:b/>
+          <w:bCs/>
+          <w:lang w:val="es-AR"/>
+        </w:rPr>
         <w:t>valor incremental</w:t>
       </w:r>
       <w:r>
@@ -2858,6 +3177,7 @@
         </w:rPr>
         <w:t xml:space="preserve"> de </w:t>
       </w:r>
+      <w:proofErr w:type="spellStart"/>
       <w:r>
         <w:rPr>
           <w:i/>
@@ -2867,11 +3187,26 @@
         <w:lastRenderedPageBreak/>
         <w:t>transformers</w:t>
       </w:r>
-      <w:r>
-        <w:rPr>
-          <w:lang w:val="es-AR"/>
-        </w:rPr>
-        <w:t xml:space="preserve"> frente a baselines “clásicos” para HS04 (Top-N y métricas balanceadas). </w:t>
+      <w:proofErr w:type="spellEnd"/>
+      <w:r>
+        <w:rPr>
+          <w:lang w:val="es-AR"/>
+        </w:rPr>
+        <w:t xml:space="preserve"> frente a </w:t>
+      </w:r>
+      <w:proofErr w:type="spellStart"/>
+      <w:r>
+        <w:rPr>
+          <w:lang w:val="es-AR"/>
+        </w:rPr>
+        <w:t>baselines</w:t>
+      </w:r>
+      <w:proofErr w:type="spellEnd"/>
+      <w:r>
+        <w:rPr>
+          <w:lang w:val="es-AR"/>
+        </w:rPr>
+        <w:t xml:space="preserve"> “clásicos” para HS04 (Top-N y métricas balanceadas). </w:t>
       </w:r>
     </w:p>
     <w:p>
@@ -3107,6 +3442,7 @@
           <w:b w:val="0"/>
           <w:sz w:val="22"/>
           <w:szCs w:val="22"/>
+          <w:lang w:bidi="hi-IN"/>
         </w:rPr>
         <w:id w:val="637231033"/>
         <w:docPartObj>
@@ -3117,7 +3453,7 @@
       <w:sdtEndPr>
         <w:rPr>
           <w:sz w:val="24"/>
-          <w:lang w:val="es-AR" w:bidi="hi-IN"/>
+          <w:lang w:val="es-AR"/>
         </w:rPr>
       </w:sdtEndPr>
       <w:sdtContent>
@@ -3128,12 +3464,14 @@
               <w:lang w:val="en-GB"/>
             </w:rPr>
           </w:pPr>
+          <w:proofErr w:type="spellStart"/>
           <w:r>
             <w:rPr>
               <w:lang w:val="en-GB"/>
             </w:rPr>
             <w:t>Referencias</w:t>
           </w:r>
+          <w:proofErr w:type="spellEnd"/>
         </w:p>
         <w:sdt>
           <w:sdtPr>
@@ -6295,6 +6633,7 @@
   <w:style w:type="character" w:default="1" w:styleId="Fuentedeprrafopredeter">
     <w:name w:val="Default Paragraph Font"/>
     <w:uiPriority w:val="1"/>
+    <w:semiHidden/>
     <w:unhideWhenUsed/>
   </w:style>
   <w:style w:type="table" w:default="1" w:styleId="Tablanormal">
@@ -6801,12 +7140,6 @@
 </file>
 
 <file path=customXml/item1.xml><?xml version="1.0" encoding="utf-8"?>
-<go:gDocsCustomXmlDataStorage xmlns:go="http://customooxmlschemas.google.com/" xmlns:r="http://schemas.openxmlformats.org/officeDocument/2006/relationships" uri="GoogleDocsCustomDataVersion2">
-  <go:docsCustomData xmlns:go="http://customooxmlschemas.google.com/" roundtripDataSignature="AMtx7mgmmI3UaXwSU46HXUgvltezJNtOeQ==">CgMxLjA4AHIhMWQxb2RqNHlIVnlUeGd5M3VuUzRELUZhR043X25qUERJ</go:docsCustomData>
-</go:gDocsCustomXmlDataStorage>
-</file>
-
-<file path=customXml/item2.xml><?xml version="1.0" encoding="utf-8"?>
 <b:Sources xmlns:b="http://schemas.openxmlformats.org/officeDocument/2006/bibliography" xmlns="http://schemas.openxmlformats.org/officeDocument/2006/bibliography" SelectedStyle="\APASixthEditionOfficeOnline.xsl" StyleName="APA" Version="6">
   <b:Source>
     <b:Tag>VUC25</b:Tag>
@@ -6940,19 +7273,25 @@
 </b:Sources>
 </file>
 
+<file path=customXml/item2.xml><?xml version="1.0" encoding="utf-8"?>
+<go:gDocsCustomXmlDataStorage xmlns:go="http://customooxmlschemas.google.com/" xmlns:r="http://schemas.openxmlformats.org/officeDocument/2006/relationships" uri="GoogleDocsCustomDataVersion2">
+  <go:docsCustomData xmlns:go="http://customooxmlschemas.google.com/" roundtripDataSignature="AMtx7mgmmI3UaXwSU46HXUgvltezJNtOeQ==">CgMxLjA4AHIhMWQxb2RqNHlIVnlUeGd5M3VuUzRELUZhR043X25qUERJ</go:docsCustomData>
+</go:gDocsCustomXmlDataStorage>
+</file>
+
 <file path=customXml/itemProps1.xml><?xml version="1.0" encoding="utf-8"?>
+<ds:datastoreItem xmlns:ds="http://schemas.openxmlformats.org/officeDocument/2006/customXml" ds:itemID="{45EC3F60-BFBF-422E-ACE8-7E0479B894E2}">
+  <ds:schemaRefs>
+    <ds:schemaRef ds:uri="http://schemas.openxmlformats.org/officeDocument/2006/bibliography"/>
+  </ds:schemaRefs>
+</ds:datastoreItem>
+</file>
+
+<file path=customXml/itemProps2.xml><?xml version="1.0" encoding="utf-8"?>
 <ds:datastoreItem xmlns:ds="http://schemas.openxmlformats.org/officeDocument/2006/customXml" ds:itemID="{11111111-1234-1234-1234-123412341234}">
   <ds:schemaRefs>
     <ds:schemaRef ds:uri="http://customooxmlschemas.google.com/"/>
     <ds:schemaRef ds:uri="http://schemas.openxmlformats.org/officeDocument/2006/relationships"/>
   </ds:schemaRefs>
 </ds:datastoreItem>
-</file>
-
-<file path=customXml/itemProps2.xml><?xml version="1.0" encoding="utf-8"?>
-<ds:datastoreItem xmlns:ds="http://schemas.openxmlformats.org/officeDocument/2006/customXml" ds:itemID="{45EC3F60-BFBF-422E-ACE8-7E0479B894E2}">
-  <ds:schemaRefs>
-    <ds:schemaRef ds:uri="http://schemas.openxmlformats.org/officeDocument/2006/bibliography"/>
-  </ds:schemaRefs>
-</ds:datastoreItem>
 </file>
</xml_diff>